<commit_message>
Pendiente Implementación visual intuitiva de Módulo de Laboratorio
</commit_message>
<xml_diff>
--- a/documentación/Casos de Uso/6.0 CU Atención en Clínica y Asignación Automatizada de Pacientes.docx
+++ b/documentación/Casos de Uso/6.0 CU Atención en Clínica y Asignación Automatizada de Pacientes.docx
@@ -683,17 +683,8 @@
           <w:rFonts w:ascii="Arial" w:eastAsia="Arial" w:hAnsi="Arial" w:cs="Arial"/>
           <w:lang w:val="es-GT"/>
         </w:rPr>
-        <w:t xml:space="preserve">El paciente debe haber completado el proceso de </w:t>
-      </w:r>
-      <w:proofErr w:type="spellStart"/>
-      <w:r>
-        <w:rPr>
-          <w:rFonts w:ascii="Arial" w:eastAsia="Arial" w:hAnsi="Arial" w:cs="Arial"/>
-          <w:lang w:val="es-GT"/>
-        </w:rPr>
-        <w:t>triaje</w:t>
-      </w:r>
-      <w:proofErr w:type="spellEnd"/>
+        <w:t>El paciente debe haber completado el proceso de triaje</w:t>
+      </w:r>
       <w:r>
         <w:rPr>
           <w:rFonts w:ascii="Arial" w:eastAsia="Arial" w:hAnsi="Arial" w:cs="Arial"/>
@@ -1120,7 +1111,25 @@
           <w:bCs/>
           <w:lang w:val="es-GT"/>
         </w:rPr>
-        <w:t>FA01: Médico con Consulta Abierta</w:t>
+        <w:t>FA0</w:t>
+      </w:r>
+      <w:r>
+        <w:rPr>
+          <w:rFonts w:ascii="Arial" w:eastAsia="Arial" w:hAnsi="Arial" w:cs="Arial"/>
+          <w:b/>
+          <w:bCs/>
+          <w:lang w:val="es-GT"/>
+        </w:rPr>
+        <w:t>1</w:t>
+      </w:r>
+      <w:r>
+        <w:rPr>
+          <w:rFonts w:ascii="Arial" w:eastAsia="Arial" w:hAnsi="Arial" w:cs="Arial"/>
+          <w:b/>
+          <w:bCs/>
+          <w:lang w:val="es-GT"/>
+        </w:rPr>
+        <w:t>: Cola de Espera Vacía</w:t>
       </w:r>
       <w:r>
         <w:rPr>
@@ -1146,7 +1155,21 @@
           <w:rFonts w:ascii="Arial" w:eastAsia="Arial" w:hAnsi="Arial" w:cs="Arial"/>
           <w:lang w:val="es-GT"/>
         </w:rPr>
-        <w:t>Si el médico intenta solicitar un nuevo paciente antes de finalizar la atención activa, el sistema deniega la acción y muestra un aviso de "Consulta en curso".</w:t>
+        <w:t xml:space="preserve">Si el médico solicita un </w:t>
+      </w:r>
+      <w:r>
+        <w:rPr>
+          <w:rFonts w:ascii="Arial" w:eastAsia="Arial" w:hAnsi="Arial" w:cs="Arial"/>
+          <w:lang w:val="es-GT"/>
+        </w:rPr>
+        <w:t>paciente,</w:t>
+      </w:r>
+      <w:r>
+        <w:rPr>
+          <w:rFonts w:ascii="Arial" w:eastAsia="Arial" w:hAnsi="Arial" w:cs="Arial"/>
+          <w:lang w:val="es-GT"/>
+        </w:rPr>
+        <w:t xml:space="preserve"> pero no hay nadie en la lista de espera (triaje realizado y solvencia validada), el sistema notifica que no existen pacientes pendientes.</w:t>
       </w:r>
     </w:p>
     <w:p>
@@ -1165,6 +1188,39 @@
           <w:rFonts w:ascii="Arial" w:eastAsia="Arial" w:hAnsi="Arial" w:cs="Arial"/>
           <w:lang w:val="es-GT"/>
         </w:rPr>
+        <w:t>El sistema mantiene al médico en clínica como “Disponible”</w:t>
+      </w:r>
+      <w:r>
+        <w:rPr>
+          <w:rFonts w:ascii="Arial" w:eastAsia="Arial" w:hAnsi="Arial" w:cs="Arial"/>
+          <w:lang w:val="es-GT"/>
+        </w:rPr>
+        <w:t>, hasta que ingrese un nuevo paciente</w:t>
+      </w:r>
+      <w:r>
+        <w:rPr>
+          <w:rFonts w:ascii="Arial" w:eastAsia="Arial" w:hAnsi="Arial" w:cs="Arial"/>
+          <w:lang w:val="es-GT"/>
+        </w:rPr>
+        <w:t>.</w:t>
+      </w:r>
+    </w:p>
+    <w:p>
+      <w:pPr>
+        <w:numPr>
+          <w:ilvl w:val="1"/>
+          <w:numId w:val="5"/>
+        </w:numPr>
+        <w:rPr>
+          <w:rFonts w:ascii="Arial" w:eastAsia="Arial" w:hAnsi="Arial" w:cs="Arial"/>
+          <w:lang w:val="es-GT"/>
+        </w:rPr>
+      </w:pPr>
+      <w:r>
+        <w:rPr>
+          <w:rFonts w:ascii="Arial" w:eastAsia="Arial" w:hAnsi="Arial" w:cs="Arial"/>
+          <w:lang w:val="es-GT"/>
+        </w:rPr>
         <w:t>Fin de flujo alterno</w:t>
       </w:r>
     </w:p>
@@ -1186,128 +1242,8 @@
           <w:bCs/>
           <w:lang w:val="es-GT"/>
         </w:rPr>
-        <w:t>FA02: Cola de Espera Vacía</w:t>
-      </w:r>
-      <w:r>
-        <w:rPr>
-          <w:rFonts w:ascii="Arial" w:eastAsia="Arial" w:hAnsi="Arial" w:cs="Arial"/>
-          <w:lang w:val="es-GT"/>
-        </w:rPr>
-        <w:t xml:space="preserve"> </w:t>
-      </w:r>
-    </w:p>
-    <w:p>
-      <w:pPr>
-        <w:numPr>
-          <w:ilvl w:val="1"/>
-          <w:numId w:val="5"/>
-        </w:numPr>
-        <w:rPr>
-          <w:rFonts w:ascii="Arial" w:eastAsia="Arial" w:hAnsi="Arial" w:cs="Arial"/>
-          <w:lang w:val="es-GT"/>
-        </w:rPr>
-      </w:pPr>
-      <w:r>
-        <w:rPr>
-          <w:rFonts w:ascii="Arial" w:eastAsia="Arial" w:hAnsi="Arial" w:cs="Arial"/>
-          <w:lang w:val="es-GT"/>
-        </w:rPr>
-        <w:t xml:space="preserve">Si el médico solicita un </w:t>
-      </w:r>
-      <w:r>
-        <w:rPr>
-          <w:rFonts w:ascii="Arial" w:eastAsia="Arial" w:hAnsi="Arial" w:cs="Arial"/>
-          <w:lang w:val="es-GT"/>
-        </w:rPr>
-        <w:t>paciente,</w:t>
-      </w:r>
-      <w:r>
-        <w:rPr>
-          <w:rFonts w:ascii="Arial" w:eastAsia="Arial" w:hAnsi="Arial" w:cs="Arial"/>
-          <w:lang w:val="es-GT"/>
-        </w:rPr>
-        <w:t xml:space="preserve"> pero no hay nadie en la lista de espera (</w:t>
-      </w:r>
-      <w:proofErr w:type="spellStart"/>
-      <w:r>
-        <w:rPr>
-          <w:rFonts w:ascii="Arial" w:eastAsia="Arial" w:hAnsi="Arial" w:cs="Arial"/>
-          <w:lang w:val="es-GT"/>
-        </w:rPr>
-        <w:t>triaje</w:t>
-      </w:r>
-      <w:proofErr w:type="spellEnd"/>
-      <w:r>
-        <w:rPr>
-          <w:rFonts w:ascii="Arial" w:eastAsia="Arial" w:hAnsi="Arial" w:cs="Arial"/>
-          <w:lang w:val="es-GT"/>
-        </w:rPr>
-        <w:t xml:space="preserve"> realizado y solvencia validada), el sistema notifica que no existen pacientes pendientes.</w:t>
-      </w:r>
-    </w:p>
-    <w:p>
-      <w:pPr>
-        <w:numPr>
-          <w:ilvl w:val="1"/>
-          <w:numId w:val="5"/>
-        </w:numPr>
-        <w:rPr>
-          <w:rFonts w:ascii="Arial" w:eastAsia="Arial" w:hAnsi="Arial" w:cs="Arial"/>
-          <w:lang w:val="es-GT"/>
-        </w:rPr>
-      </w:pPr>
-      <w:r>
-        <w:rPr>
-          <w:rFonts w:ascii="Arial" w:eastAsia="Arial" w:hAnsi="Arial" w:cs="Arial"/>
-          <w:lang w:val="es-GT"/>
-        </w:rPr>
-        <w:t>El sistema mantiene al médico en clínica como “Disponible”</w:t>
-      </w:r>
-      <w:r>
-        <w:rPr>
-          <w:rFonts w:ascii="Arial" w:eastAsia="Arial" w:hAnsi="Arial" w:cs="Arial"/>
-          <w:lang w:val="es-GT"/>
-        </w:rPr>
-        <w:t>, hasta que ingrese un nuevo paciente</w:t>
-      </w:r>
-      <w:r>
-        <w:rPr>
-          <w:rFonts w:ascii="Arial" w:eastAsia="Arial" w:hAnsi="Arial" w:cs="Arial"/>
-          <w:lang w:val="es-GT"/>
-        </w:rPr>
-        <w:t>.</w:t>
-      </w:r>
-    </w:p>
-    <w:p>
-      <w:pPr>
-        <w:numPr>
-          <w:ilvl w:val="1"/>
-          <w:numId w:val="5"/>
-        </w:numPr>
-        <w:rPr>
-          <w:rFonts w:ascii="Arial" w:eastAsia="Arial" w:hAnsi="Arial" w:cs="Arial"/>
-          <w:lang w:val="es-GT"/>
-        </w:rPr>
-      </w:pPr>
-      <w:r>
-        <w:rPr>
-          <w:rFonts w:ascii="Arial" w:eastAsia="Arial" w:hAnsi="Arial" w:cs="Arial"/>
-          <w:lang w:val="es-GT"/>
-        </w:rPr>
-        <w:t>Fin de flujo alterno</w:t>
-      </w:r>
-    </w:p>
-    <w:p>
-      <w:pPr>
-        <w:numPr>
-          <w:ilvl w:val="0"/>
-          <w:numId w:val="5"/>
-        </w:numPr>
-        <w:rPr>
-          <w:rFonts w:ascii="Arial" w:eastAsia="Arial" w:hAnsi="Arial" w:cs="Arial"/>
-          <w:lang w:val="es-GT"/>
-        </w:rPr>
-      </w:pPr>
+        <w:t>FA0</w:t>
+      </w:r>
       <w:r>
         <w:rPr>
           <w:rFonts w:ascii="Arial" w:eastAsia="Arial" w:hAnsi="Arial" w:cs="Arial"/>
@@ -1315,7 +1251,16 @@
           <w:bCs/>
           <w:lang w:val="es-GT"/>
         </w:rPr>
-        <w:t>FA03: Seguimiento Médico</w:t>
+        <w:t>2</w:t>
+      </w:r>
+      <w:r>
+        <w:rPr>
+          <w:rFonts w:ascii="Arial" w:eastAsia="Arial" w:hAnsi="Arial" w:cs="Arial"/>
+          <w:b/>
+          <w:bCs/>
+          <w:lang w:val="es-GT"/>
+        </w:rPr>
+        <w:t>: Seguimiento Médico</w:t>
       </w:r>
     </w:p>
     <w:p>

</xml_diff>